<commit_message>
docs: update invoice F-0010-2026 and English templates
</commit_message>
<xml_diff>
--- a/legal/facturas_emitidas/J2T/2026/F-0010-2026/F-0010-2026_invoice_en.docx
+++ b/legal/facturas_emitidas/J2T/2026/F-0010-2026/F-0010-2026_invoice_en.docx
@@ -635,7 +635,7 @@
                 <w:between w:space="0" w:sz="0" w:val="nil"/>
               </w:pBdr>
               <w:shd w:fill="auto" w:val="clear"/>
-              <w:spacing w:after="0" w:before="2420.53955078125" w:line="240" w:lineRule="auto"/>
+              <w:spacing w:after="0" w:before="505.53955078125" w:line="240" w:lineRule="auto"/>
               <w:ind w:left="0" w:right="0" w:firstLine="0"/>
               <w:jc w:val="left"/>
               <w:rPr>
@@ -818,6 +818,15 @@
         </w:tc>
       </w:tr>
     </w:tbl>
+    <w:p>
+      <w:pPr>
+        <w:spacing w:before="400" w:after="0" w:line="240" w:lineRule="auto"/>
+        <w:rPr>
+          <w:sz w:val="4"/>
+          <w:szCs w:val="4"/>
+        </w:rPr>
+      </w:pPr>
+    </w:p>
     <w:tbl>
       <w:tblPr>
         <w:tblStyle w:val="Table1"/>

</xml_diff>